<commit_message>
Yodsanon_0215: add test incident and report
</commit_message>
<xml_diff>
--- a/doc/Sprint3/Item11 report incidents/APITest/APITest.docx
+++ b/doc/Sprint3/Item11 report incidents/APITest/APITest.docx
@@ -952,7 +952,7 @@
           <w:numId w:val="19"/>
         </w:numPr>
         <w:rPr>
-          <w:rFonts w:ascii="TH SarabunPSK" w:hAnsi="TH SarabunPSK" w:cs="TH SarabunPSK" w:hint="cs"/>
+          <w:rFonts w:ascii="TH SarabunPSK" w:hAnsi="TH SarabunPSK" w:cs="TH SarabunPSK"/>
           <w:sz w:val="32"/>
           <w:szCs w:val="32"/>
         </w:rPr>
@@ -1027,7 +1027,7 @@
           <w:numId w:val="19"/>
         </w:numPr>
         <w:rPr>
-          <w:rFonts w:ascii="TH SarabunPSK" w:hAnsi="TH SarabunPSK" w:cs="TH SarabunPSK" w:hint="cs"/>
+          <w:rFonts w:ascii="TH SarabunPSK" w:hAnsi="TH SarabunPSK" w:cs="TH SarabunPSK"/>
           <w:sz w:val="32"/>
           <w:szCs w:val="32"/>
         </w:rPr>
@@ -1153,7 +1153,7 @@
           <w:numId w:val="19"/>
         </w:numPr>
         <w:rPr>
-          <w:rFonts w:ascii="TH SarabunPSK" w:hAnsi="TH SarabunPSK" w:cs="TH SarabunPSK" w:hint="cs"/>
+          <w:rFonts w:ascii="TH SarabunPSK" w:hAnsi="TH SarabunPSK" w:cs="TH SarabunPSK"/>
           <w:sz w:val="32"/>
           <w:szCs w:val="32"/>
         </w:rPr>
@@ -1370,7 +1370,7 @@
           <w:numId w:val="19"/>
         </w:numPr>
         <w:rPr>
-          <w:rFonts w:ascii="TH SarabunPSK" w:hAnsi="TH SarabunPSK" w:cs="TH SarabunPSK" w:hint="cs"/>
+          <w:rFonts w:ascii="TH SarabunPSK" w:hAnsi="TH SarabunPSK" w:cs="TH SarabunPSK"/>
           <w:sz w:val="32"/>
           <w:szCs w:val="32"/>
         </w:rPr>
@@ -1479,7 +1479,7 @@
           <w:numId w:val="19"/>
         </w:numPr>
         <w:rPr>
-          <w:rFonts w:ascii="TH SarabunPSK" w:hAnsi="TH SarabunPSK" w:cs="TH SarabunPSK" w:hint="cs"/>
+          <w:rFonts w:ascii="TH SarabunPSK" w:hAnsi="TH SarabunPSK" w:cs="TH SarabunPSK"/>
           <w:sz w:val="32"/>
           <w:szCs w:val="32"/>
         </w:rPr>
@@ -2292,6 +2292,86 @@
     </w:p>
     <w:p>
       <w:pPr>
+        <w:ind w:firstLine="360"/>
+        <w:rPr>
+          <w:rFonts w:ascii="TH SarabunPSK" w:hAnsi="TH SarabunPSK" w:cs="TH SarabunPSK"/>
+          <w:sz w:val="32"/>
+          <w:szCs w:val="32"/>
+          <w:lang w:bidi="th-TH"/>
+        </w:rPr>
+      </w:pPr>
+      <w:r>
+        <w:rPr>
+          <w:rFonts w:ascii="TH SarabunPSK" w:hAnsi="TH SarabunPSK" w:cs="TH SarabunPSK" w:hint="cs"/>
+          <w:sz w:val="32"/>
+          <w:szCs w:val="32"/>
+          <w:lang w:bidi="th-TH"/>
+        </w:rPr>
+        <w:lastRenderedPageBreak/>
+        <w:t xml:space="preserve">3.2 </w:t>
+      </w:r>
+      <w:r>
+        <w:rPr>
+          <w:rFonts w:ascii="TH SarabunPSK" w:hAnsi="TH SarabunPSK" w:cs="TH SarabunPSK" w:hint="cs"/>
+          <w:sz w:val="32"/>
+          <w:szCs w:val="32"/>
+          <w:cs/>
+          <w:lang w:bidi="th-TH"/>
+        </w:rPr>
+        <w:t xml:space="preserve">ข้อมูลการทดสอบ </w:t>
+      </w:r>
+      <w:r>
+        <w:rPr>
+          <w:rFonts w:ascii="TH SarabunPSK" w:hAnsi="TH SarabunPSK" w:cs="TH SarabunPSK" w:hint="cs"/>
+          <w:sz w:val="32"/>
+          <w:szCs w:val="32"/>
+          <w:lang w:bidi="th-TH"/>
+        </w:rPr>
+        <w:t>(Test Data)</w:t>
+      </w:r>
+    </w:p>
+    <w:p>
+      <w:pPr>
+        <w:ind w:firstLine="360"/>
+        <w:rPr>
+          <w:rFonts w:ascii="TH SarabunPSK" w:hAnsi="TH SarabunPSK" w:cs="TH SarabunPSK"/>
+          <w:sz w:val="32"/>
+          <w:szCs w:val="32"/>
+          <w:lang w:bidi="th-TH"/>
+        </w:rPr>
+      </w:pPr>
+      <w:r>
+        <w:rPr>
+          <w:rFonts w:ascii="TH SarabunPSK" w:hAnsi="TH SarabunPSK" w:cs="TH SarabunPSK"/>
+          <w:sz w:val="32"/>
+          <w:szCs w:val="32"/>
+          <w:lang w:bidi="th-TH"/>
+        </w:rPr>
+        <w:t>${BASE_</w:t>
+      </w:r>
+      <w:proofErr w:type="gramStart"/>
+      <w:r>
+        <w:rPr>
+          <w:rFonts w:ascii="TH SarabunPSK" w:hAnsi="TH SarabunPSK" w:cs="TH SarabunPSK"/>
+          <w:sz w:val="32"/>
+          <w:szCs w:val="32"/>
+          <w:lang w:bidi="th-TH"/>
+        </w:rPr>
+        <w:t xml:space="preserve">URL}   </w:t>
+      </w:r>
+      <w:proofErr w:type="gramEnd"/>
+      <w:r>
+        <w:rPr>
+          <w:rFonts w:ascii="TH SarabunPSK" w:hAnsi="TH SarabunPSK" w:cs="TH SarabunPSK"/>
+          <w:sz w:val="32"/>
+          <w:szCs w:val="32"/>
+          <w:lang w:bidi="th-TH"/>
+        </w:rPr>
+        <w:t>      https://deploy-production-88fa.up.railway.app/api</w:t>
+      </w:r>
+    </w:p>
+    <w:p>
+      <w:pPr>
         <w:pStyle w:val="ListParagraph"/>
         <w:ind w:left="360"/>
         <w:rPr>
@@ -2308,6 +2388,173 @@
           <w:szCs w:val="32"/>
           <w:lang w:bidi="th-TH"/>
         </w:rPr>
+        <w:t>${ADMIN_</w:t>
+      </w:r>
+      <w:proofErr w:type="gramStart"/>
+      <w:r>
+        <w:rPr>
+          <w:rFonts w:ascii="TH SarabunPSK" w:hAnsi="TH SarabunPSK" w:cs="TH SarabunPSK"/>
+          <w:sz w:val="32"/>
+          <w:szCs w:val="32"/>
+          <w:lang w:bidi="th-TH"/>
+        </w:rPr>
+        <w:t xml:space="preserve">USER}   </w:t>
+      </w:r>
+      <w:proofErr w:type="gramEnd"/>
+      <w:r>
+        <w:rPr>
+          <w:rFonts w:ascii="TH SarabunPSK" w:hAnsi="TH SarabunPSK" w:cs="TH SarabunPSK"/>
+          <w:sz w:val="32"/>
+          <w:szCs w:val="32"/>
+          <w:lang w:bidi="th-TH"/>
+        </w:rPr>
+        <w:t>    admin@example.com          </w:t>
+      </w:r>
+    </w:p>
+    <w:p>
+      <w:pPr>
+        <w:pStyle w:val="ListParagraph"/>
+        <w:ind w:left="360"/>
+        <w:rPr>
+          <w:rFonts w:ascii="TH SarabunPSK" w:hAnsi="TH SarabunPSK" w:cs="TH SarabunPSK"/>
+          <w:sz w:val="32"/>
+          <w:szCs w:val="32"/>
+          <w:lang w:bidi="th-TH"/>
+        </w:rPr>
+      </w:pPr>
+      <w:r>
+        <w:rPr>
+          <w:rFonts w:ascii="TH SarabunPSK" w:hAnsi="TH SarabunPSK" w:cs="TH SarabunPSK"/>
+          <w:sz w:val="32"/>
+          <w:szCs w:val="32"/>
+          <w:lang w:bidi="th-TH"/>
+        </w:rPr>
+        <w:t>${ADMIN_</w:t>
+      </w:r>
+      <w:proofErr w:type="gramStart"/>
+      <w:r>
+        <w:rPr>
+          <w:rFonts w:ascii="TH SarabunPSK" w:hAnsi="TH SarabunPSK" w:cs="TH SarabunPSK"/>
+          <w:sz w:val="32"/>
+          <w:szCs w:val="32"/>
+          <w:lang w:bidi="th-TH"/>
+        </w:rPr>
+        <w:t xml:space="preserve">PASSWORD}   </w:t>
+      </w:r>
+      <w:proofErr w:type="gramEnd"/>
+      <w:r>
+        <w:rPr>
+          <w:rFonts w:ascii="TH SarabunPSK" w:hAnsi="TH SarabunPSK" w:cs="TH SarabunPSK"/>
+          <w:sz w:val="32"/>
+          <w:szCs w:val="32"/>
+          <w:lang w:bidi="th-TH"/>
+        </w:rPr>
+        <w:t>123456789</w:t>
+      </w:r>
+    </w:p>
+    <w:p>
+      <w:pPr>
+        <w:pStyle w:val="ListParagraph"/>
+        <w:ind w:left="360"/>
+        <w:rPr>
+          <w:rFonts w:ascii="TH SarabunPSK" w:hAnsi="TH SarabunPSK" w:cs="TH SarabunPSK"/>
+          <w:sz w:val="32"/>
+          <w:szCs w:val="32"/>
+          <w:lang w:bidi="th-TH"/>
+        </w:rPr>
+      </w:pPr>
+      <w:r>
+        <w:rPr>
+          <w:rFonts w:ascii="TH SarabunPSK" w:hAnsi="TH SarabunPSK" w:cs="TH SarabunPSK"/>
+          <w:sz w:val="32"/>
+          <w:szCs w:val="32"/>
+          <w:lang w:bidi="th-TH"/>
+        </w:rPr>
+        <w:t>${DRIVER_</w:t>
+      </w:r>
+      <w:proofErr w:type="gramStart"/>
+      <w:r>
+        <w:rPr>
+          <w:rFonts w:ascii="TH SarabunPSK" w:hAnsi="TH SarabunPSK" w:cs="TH SarabunPSK"/>
+          <w:sz w:val="32"/>
+          <w:szCs w:val="32"/>
+          <w:lang w:bidi="th-TH"/>
+        </w:rPr>
+        <w:t xml:space="preserve">USER}   </w:t>
+      </w:r>
+      <w:proofErr w:type="gramEnd"/>
+      <w:r>
+        <w:rPr>
+          <w:rFonts w:ascii="TH SarabunPSK" w:hAnsi="TH SarabunPSK" w:cs="TH SarabunPSK"/>
+          <w:sz w:val="32"/>
+          <w:szCs w:val="32"/>
+          <w:lang w:bidi="th-TH"/>
+        </w:rPr>
+        <w:t>   tester1@ex.com</w:t>
+      </w:r>
+    </w:p>
+    <w:p>
+      <w:pPr>
+        <w:pStyle w:val="ListParagraph"/>
+        <w:ind w:left="360"/>
+        <w:rPr>
+          <w:rFonts w:ascii="TH SarabunPSK" w:hAnsi="TH SarabunPSK" w:cs="TH SarabunPSK"/>
+          <w:sz w:val="32"/>
+          <w:szCs w:val="32"/>
+          <w:lang w:bidi="th-TH"/>
+        </w:rPr>
+      </w:pPr>
+      <w:r>
+        <w:rPr>
+          <w:rFonts w:ascii="TH SarabunPSK" w:hAnsi="TH SarabunPSK" w:cs="TH SarabunPSK"/>
+          <w:sz w:val="32"/>
+          <w:szCs w:val="32"/>
+          <w:lang w:bidi="th-TH"/>
+        </w:rPr>
+        <w:t>${DRIVER_</w:t>
+      </w:r>
+      <w:proofErr w:type="gramStart"/>
+      <w:r>
+        <w:rPr>
+          <w:rFonts w:ascii="TH SarabunPSK" w:hAnsi="TH SarabunPSK" w:cs="TH SarabunPSK"/>
+          <w:sz w:val="32"/>
+          <w:szCs w:val="32"/>
+          <w:lang w:bidi="th-TH"/>
+        </w:rPr>
+        <w:t>PASSWORD}  123456789</w:t>
+      </w:r>
+      <w:proofErr w:type="gramEnd"/>
+    </w:p>
+    <w:p>
+      <w:pPr>
+        <w:pStyle w:val="ListParagraph"/>
+        <w:ind w:left="360"/>
+        <w:rPr>
+          <w:rFonts w:ascii="TH SarabunPSK" w:hAnsi="TH SarabunPSK" w:cs="TH SarabunPSK"/>
+          <w:sz w:val="32"/>
+          <w:szCs w:val="32"/>
+          <w:lang w:bidi="th-TH"/>
+        </w:rPr>
+      </w:pPr>
+    </w:p>
+    <w:p>
+      <w:pPr>
+        <w:pStyle w:val="ListParagraph"/>
+        <w:ind w:left="360"/>
+        <w:rPr>
+          <w:rFonts w:ascii="TH SarabunPSK" w:hAnsi="TH SarabunPSK" w:cs="TH SarabunPSK"/>
+          <w:sz w:val="32"/>
+          <w:szCs w:val="32"/>
+          <w:lang w:bidi="th-TH"/>
+        </w:rPr>
+      </w:pPr>
+      <w:r>
+        <w:rPr>
+          <w:rFonts w:ascii="TH SarabunPSK" w:hAnsi="TH SarabunPSK" w:cs="TH SarabunPSK"/>
+          <w:sz w:val="32"/>
+          <w:szCs w:val="32"/>
+          <w:lang w:bidi="th-TH"/>
+        </w:rPr>
         <w:t>3</w:t>
       </w:r>
       <w:r>
@@ -2322,12 +2569,21 @@
       </w:r>
       <w:r>
         <w:rPr>
-          <w:rFonts w:ascii="TH SarabunPSK" w:hAnsi="TH SarabunPSK" w:cs="TH SarabunPSK" w:hint="cs"/>
-          <w:sz w:val="32"/>
-          <w:szCs w:val="32"/>
-          <w:lang w:bidi="th-TH"/>
-        </w:rPr>
-        <w:t xml:space="preserve">2 </w:t>
+          <w:rFonts w:ascii="TH SarabunPSK" w:hAnsi="TH SarabunPSK" w:cs="TH SarabunPSK"/>
+          <w:sz w:val="32"/>
+          <w:szCs w:val="32"/>
+          <w:lang w:bidi="th-TH"/>
+        </w:rPr>
+        <w:t>3</w:t>
+      </w:r>
+      <w:r>
+        <w:rPr>
+          <w:rFonts w:ascii="TH SarabunPSK" w:hAnsi="TH SarabunPSK" w:cs="TH SarabunPSK" w:hint="cs"/>
+          <w:sz w:val="32"/>
+          <w:szCs w:val="32"/>
+          <w:lang w:bidi="th-TH"/>
+        </w:rPr>
+        <w:t xml:space="preserve"> </w:t>
       </w:r>
       <w:r>
         <w:rPr>
@@ -2577,7 +2833,7 @@
           <w:p>
             <w:pPr>
               <w:rPr>
-                <w:rFonts w:ascii="TH SarabunPSK" w:hAnsi="TH SarabunPSK" w:cs="TH SarabunPSK" w:hint="cs"/>
+                <w:rFonts w:ascii="TH SarabunPSK" w:hAnsi="TH SarabunPSK" w:cs="TH SarabunPSK"/>
                 <w:sz w:val="32"/>
                 <w:szCs w:val="32"/>
                 <w:cs/>
@@ -3056,7 +3312,7 @@
           <w:p>
             <w:pPr>
               <w:rPr>
-                <w:rFonts w:ascii="TH SarabunPSK" w:hAnsi="TH SarabunPSK" w:cs="TH SarabunPSK" w:hint="cs"/>
+                <w:rFonts w:ascii="TH SarabunPSK" w:hAnsi="TH SarabunPSK" w:cs="TH SarabunPSK"/>
                 <w:sz w:val="32"/>
                 <w:szCs w:val="32"/>
                 <w:cs/>
@@ -3313,7 +3569,7 @@
             <w:pPr>
               <w:jc w:val="center"/>
               <w:rPr>
-                <w:rFonts w:ascii="TH SarabunPSK" w:hAnsi="TH SarabunPSK" w:cs="TH SarabunPSK" w:hint="cs"/>
+                <w:rFonts w:ascii="TH SarabunPSK" w:hAnsi="TH SarabunPSK" w:cs="TH SarabunPSK"/>
                 <w:b/>
                 <w:bCs/>
                 <w:sz w:val="32"/>
@@ -3344,7 +3600,7 @@
             <w:pPr>
               <w:jc w:val="center"/>
               <w:rPr>
-                <w:rFonts w:ascii="TH SarabunPSK" w:hAnsi="TH SarabunPSK" w:cs="TH SarabunPSK" w:hint="cs"/>
+                <w:rFonts w:ascii="TH SarabunPSK" w:hAnsi="TH SarabunPSK" w:cs="TH SarabunPSK"/>
                 <w:b/>
                 <w:bCs/>
                 <w:sz w:val="32"/>
@@ -3374,7 +3630,7 @@
             <w:pPr>
               <w:jc w:val="center"/>
               <w:rPr>
-                <w:rFonts w:ascii="TH SarabunPSK" w:hAnsi="TH SarabunPSK" w:cs="TH SarabunPSK" w:hint="cs"/>
+                <w:rFonts w:ascii="TH SarabunPSK" w:hAnsi="TH SarabunPSK" w:cs="TH SarabunPSK"/>
                 <w:b/>
                 <w:bCs/>
                 <w:sz w:val="32"/>
@@ -3405,7 +3661,7 @@
             <w:pPr>
               <w:jc w:val="center"/>
               <w:rPr>
-                <w:rFonts w:ascii="TH SarabunPSK" w:hAnsi="TH SarabunPSK" w:cs="TH SarabunPSK" w:hint="cs"/>
+                <w:rFonts w:ascii="TH SarabunPSK" w:hAnsi="TH SarabunPSK" w:cs="TH SarabunPSK"/>
                 <w:b/>
                 <w:bCs/>
                 <w:sz w:val="32"/>
@@ -3553,7 +3809,7 @@
             <w:pPr>
               <w:jc w:val="center"/>
               <w:rPr>
-                <w:rFonts w:ascii="TH SarabunPSK" w:hAnsi="TH SarabunPSK" w:cs="TH SarabunPSK" w:hint="cs"/>
+                <w:rFonts w:ascii="TH SarabunPSK" w:hAnsi="TH SarabunPSK" w:cs="TH SarabunPSK"/>
                 <w:sz w:val="32"/>
                 <w:szCs w:val="32"/>
                 <w:lang w:bidi="th-TH"/>
@@ -3582,7 +3838,7 @@
               <w:pStyle w:val="NormalWeb"/>
               <w:spacing w:before="0" w:beforeAutospacing="0" w:after="0" w:afterAutospacing="0"/>
               <w:rPr>
-                <w:rFonts w:ascii="TH SarabunPSK" w:hAnsi="TH SarabunPSK" w:cs="TH SarabunPSK" w:hint="cs"/>
+                <w:rFonts w:ascii="TH SarabunPSK" w:hAnsi="TH SarabunPSK" w:cs="TH SarabunPSK"/>
                 <w:color w:val="1F1F1F"/>
                 <w:sz w:val="32"/>
                 <w:szCs w:val="32"/>
@@ -3604,7 +3860,7 @@
           <w:p>
             <w:pPr>
               <w:rPr>
-                <w:rFonts w:ascii="TH SarabunPSK" w:hAnsi="TH SarabunPSK" w:cs="TH SarabunPSK" w:hint="cs"/>
+                <w:rFonts w:ascii="TH SarabunPSK" w:hAnsi="TH SarabunPSK" w:cs="TH SarabunPSK"/>
                 <w:sz w:val="32"/>
                 <w:szCs w:val="32"/>
                 <w:lang w:bidi="th-TH"/>
@@ -3716,7 +3972,7 @@
           <w:p>
             <w:pPr>
               <w:rPr>
-                <w:rFonts w:ascii="TH SarabunPSK" w:hAnsi="TH SarabunPSK" w:cs="TH SarabunPSK" w:hint="cs"/>
+                <w:rFonts w:ascii="TH SarabunPSK" w:hAnsi="TH SarabunPSK" w:cs="TH SarabunPSK"/>
                 <w:sz w:val="32"/>
                 <w:szCs w:val="32"/>
                 <w:cs/>
@@ -3797,7 +4053,7 @@
           <w:p>
             <w:pPr>
               <w:rPr>
-                <w:rFonts w:ascii="TH SarabunPSK" w:hAnsi="TH SarabunPSK" w:cs="TH SarabunPSK" w:hint="cs"/>
+                <w:rFonts w:ascii="TH SarabunPSK" w:hAnsi="TH SarabunPSK" w:cs="TH SarabunPSK"/>
                 <w:sz w:val="32"/>
                 <w:szCs w:val="32"/>
                 <w:lang w:bidi="th-TH"/>
@@ -3907,7 +4163,7 @@
             <w:pPr>
               <w:jc w:val="center"/>
               <w:rPr>
-                <w:rFonts w:ascii="TH SarabunPSK" w:hAnsi="TH SarabunPSK" w:cs="TH SarabunPSK" w:hint="cs"/>
+                <w:rFonts w:ascii="TH SarabunPSK" w:hAnsi="TH SarabunPSK" w:cs="TH SarabunPSK"/>
                 <w:sz w:val="32"/>
                 <w:szCs w:val="32"/>
                 <w:lang w:bidi="th-TH"/>
@@ -3936,7 +4192,7 @@
               <w:pStyle w:val="NormalWeb"/>
               <w:spacing w:before="0" w:beforeAutospacing="0" w:after="0" w:afterAutospacing="0"/>
               <w:rPr>
-                <w:rFonts w:ascii="TH SarabunPSK" w:hAnsi="TH SarabunPSK" w:cs="TH SarabunPSK" w:hint="cs"/>
+                <w:rFonts w:ascii="TH SarabunPSK" w:hAnsi="TH SarabunPSK" w:cs="TH SarabunPSK"/>
                 <w:color w:val="1F1F1F"/>
                 <w:sz w:val="32"/>
                 <w:szCs w:val="32"/>
@@ -3958,7 +4214,7 @@
           <w:p>
             <w:pPr>
               <w:rPr>
-                <w:rFonts w:ascii="TH SarabunPSK" w:hAnsi="TH SarabunPSK" w:cs="TH SarabunPSK" w:hint="cs"/>
+                <w:rFonts w:ascii="TH SarabunPSK" w:hAnsi="TH SarabunPSK" w:cs="TH SarabunPSK"/>
                 <w:sz w:val="32"/>
                 <w:szCs w:val="32"/>
                 <w:lang w:bidi="th-TH"/>
@@ -4042,7 +4298,7 @@
           <w:p>
             <w:pPr>
               <w:rPr>
-                <w:rFonts w:ascii="TH SarabunPSK" w:hAnsi="TH SarabunPSK" w:cs="TH SarabunPSK" w:hint="cs"/>
+                <w:rFonts w:ascii="TH SarabunPSK" w:hAnsi="TH SarabunPSK" w:cs="TH SarabunPSK"/>
                 <w:sz w:val="32"/>
                 <w:szCs w:val="32"/>
                 <w:lang w:bidi="th-TH"/>
@@ -4080,7 +4336,7 @@
           <w:p>
             <w:pPr>
               <w:rPr>
-                <w:rFonts w:ascii="TH SarabunPSK" w:hAnsi="TH SarabunPSK" w:cs="TH SarabunPSK" w:hint="cs"/>
+                <w:rFonts w:ascii="TH SarabunPSK" w:hAnsi="TH SarabunPSK" w:cs="TH SarabunPSK"/>
                 <w:sz w:val="32"/>
                 <w:szCs w:val="32"/>
                 <w:lang w:bidi="th-TH"/>
@@ -4190,7 +4446,7 @@
             <w:pPr>
               <w:jc w:val="center"/>
               <w:rPr>
-                <w:rFonts w:ascii="TH SarabunPSK" w:hAnsi="TH SarabunPSK" w:cs="TH SarabunPSK" w:hint="cs"/>
+                <w:rFonts w:ascii="TH SarabunPSK" w:hAnsi="TH SarabunPSK" w:cs="TH SarabunPSK"/>
                 <w:b/>
                 <w:bCs/>
                 <w:sz w:val="32"/>
@@ -4221,7 +4477,7 @@
               <w:pStyle w:val="NormalWeb"/>
               <w:spacing w:before="0" w:beforeAutospacing="0" w:after="0" w:afterAutospacing="0"/>
               <w:rPr>
-                <w:rFonts w:ascii="TH SarabunPSK" w:hAnsi="TH SarabunPSK" w:cs="TH SarabunPSK" w:hint="cs"/>
+                <w:rFonts w:ascii="TH SarabunPSK" w:hAnsi="TH SarabunPSK" w:cs="TH SarabunPSK"/>
                 <w:color w:val="1F1F1F"/>
                 <w:sz w:val="32"/>
                 <w:szCs w:val="32"/>
@@ -4243,7 +4499,7 @@
           <w:p>
             <w:pPr>
               <w:rPr>
-                <w:rFonts w:ascii="TH SarabunPSK" w:hAnsi="TH SarabunPSK" w:cs="TH SarabunPSK" w:hint="cs"/>
+                <w:rFonts w:ascii="TH SarabunPSK" w:hAnsi="TH SarabunPSK" w:cs="TH SarabunPSK"/>
                 <w:sz w:val="32"/>
                 <w:szCs w:val="32"/>
                 <w:lang w:bidi="th-TH"/>
@@ -4308,7 +4564,7 @@
           <w:p>
             <w:pPr>
               <w:rPr>
-                <w:rFonts w:ascii="TH SarabunPSK" w:hAnsi="TH SarabunPSK" w:cs="TH SarabunPSK" w:hint="cs"/>
+                <w:rFonts w:ascii="TH SarabunPSK" w:hAnsi="TH SarabunPSK" w:cs="TH SarabunPSK"/>
                 <w:sz w:val="32"/>
                 <w:szCs w:val="32"/>
                 <w:lang w:bidi="th-TH"/>
@@ -4367,7 +4623,7 @@
           <w:p>
             <w:pPr>
               <w:rPr>
-                <w:rFonts w:ascii="TH SarabunPSK" w:hAnsi="TH SarabunPSK" w:cs="TH SarabunPSK" w:hint="cs"/>
+                <w:rFonts w:ascii="TH SarabunPSK" w:hAnsi="TH SarabunPSK" w:cs="TH SarabunPSK"/>
                 <w:b/>
                 <w:bCs/>
                 <w:sz w:val="32"/>
@@ -4484,7 +4740,7 @@
             <w:pPr>
               <w:jc w:val="center"/>
               <w:rPr>
-                <w:rFonts w:ascii="TH SarabunPSK" w:hAnsi="TH SarabunPSK" w:cs="TH SarabunPSK" w:hint="cs"/>
+                <w:rFonts w:ascii="TH SarabunPSK" w:hAnsi="TH SarabunPSK" w:cs="TH SarabunPSK"/>
                 <w:sz w:val="32"/>
                 <w:szCs w:val="32"/>
                 <w:lang w:bidi="th-TH"/>
@@ -4513,7 +4769,7 @@
               <w:pStyle w:val="NormalWeb"/>
               <w:spacing w:before="0" w:beforeAutospacing="0" w:after="0" w:afterAutospacing="0"/>
               <w:rPr>
-                <w:rFonts w:ascii="TH SarabunPSK" w:hAnsi="TH SarabunPSK" w:cs="TH SarabunPSK" w:hint="cs"/>
+                <w:rFonts w:ascii="TH SarabunPSK" w:hAnsi="TH SarabunPSK" w:cs="TH SarabunPSK"/>
                 <w:color w:val="1F1F1F"/>
                 <w:sz w:val="32"/>
                 <w:szCs w:val="32"/>
@@ -4535,7 +4791,7 @@
           <w:p>
             <w:pPr>
               <w:rPr>
-                <w:rFonts w:ascii="TH SarabunPSK" w:hAnsi="TH SarabunPSK" w:cs="TH SarabunPSK" w:hint="cs"/>
+                <w:rFonts w:ascii="TH SarabunPSK" w:hAnsi="TH SarabunPSK" w:cs="TH SarabunPSK"/>
                 <w:sz w:val="32"/>
                 <w:szCs w:val="32"/>
                 <w:lang w:bidi="th-TH"/>
@@ -4600,7 +4856,7 @@
           <w:p>
             <w:pPr>
               <w:rPr>
-                <w:rFonts w:ascii="TH SarabunPSK" w:hAnsi="TH SarabunPSK" w:cs="TH SarabunPSK" w:hint="cs"/>
+                <w:rFonts w:ascii="TH SarabunPSK" w:hAnsi="TH SarabunPSK" w:cs="TH SarabunPSK"/>
                 <w:sz w:val="32"/>
                 <w:szCs w:val="32"/>
                 <w:cs/>
@@ -4660,7 +4916,7 @@
           <w:p>
             <w:pPr>
               <w:rPr>
-                <w:rFonts w:ascii="TH SarabunPSK" w:hAnsi="TH SarabunPSK" w:cs="TH SarabunPSK" w:hint="cs"/>
+                <w:rFonts w:ascii="TH SarabunPSK" w:hAnsi="TH SarabunPSK" w:cs="TH SarabunPSK"/>
                 <w:sz w:val="32"/>
                 <w:szCs w:val="32"/>
                 <w:lang w:bidi="th-TH"/>
@@ -4770,7 +5026,7 @@
             <w:pPr>
               <w:jc w:val="center"/>
               <w:rPr>
-                <w:rFonts w:ascii="TH SarabunPSK" w:hAnsi="TH SarabunPSK" w:cs="TH SarabunPSK" w:hint="cs"/>
+                <w:rFonts w:ascii="TH SarabunPSK" w:hAnsi="TH SarabunPSK" w:cs="TH SarabunPSK"/>
                 <w:sz w:val="32"/>
                 <w:szCs w:val="32"/>
                 <w:lang w:bidi="th-TH"/>
@@ -4800,7 +5056,7 @@
               <w:pStyle w:val="NormalWeb"/>
               <w:spacing w:before="0" w:beforeAutospacing="0" w:after="0" w:afterAutospacing="0"/>
               <w:rPr>
-                <w:rFonts w:ascii="TH SarabunPSK" w:hAnsi="TH SarabunPSK" w:cs="TH SarabunPSK" w:hint="cs"/>
+                <w:rFonts w:ascii="TH SarabunPSK" w:hAnsi="TH SarabunPSK" w:cs="TH SarabunPSK"/>
                 <w:color w:val="1F1F1F"/>
                 <w:sz w:val="32"/>
                 <w:szCs w:val="32"/>
@@ -4822,7 +5078,7 @@
           <w:p>
             <w:pPr>
               <w:rPr>
-                <w:rFonts w:ascii="TH SarabunPSK" w:hAnsi="TH SarabunPSK" w:cs="TH SarabunPSK" w:hint="cs"/>
+                <w:rFonts w:ascii="TH SarabunPSK" w:hAnsi="TH SarabunPSK" w:cs="TH SarabunPSK"/>
                 <w:sz w:val="32"/>
                 <w:szCs w:val="32"/>
                 <w:lang w:bidi="th-TH"/>
@@ -4887,7 +5143,7 @@
           <w:p>
             <w:pPr>
               <w:rPr>
-                <w:rFonts w:ascii="TH SarabunPSK" w:hAnsi="TH SarabunPSK" w:cs="TH SarabunPSK" w:hint="cs"/>
+                <w:rFonts w:ascii="TH SarabunPSK" w:hAnsi="TH SarabunPSK" w:cs="TH SarabunPSK"/>
                 <w:sz w:val="32"/>
                 <w:szCs w:val="32"/>
                 <w:cs/>
@@ -4926,7 +5182,7 @@
           <w:p>
             <w:pPr>
               <w:rPr>
-                <w:rFonts w:ascii="TH SarabunPSK" w:hAnsi="TH SarabunPSK" w:cs="TH SarabunPSK" w:hint="cs"/>
+                <w:rFonts w:ascii="TH SarabunPSK" w:hAnsi="TH SarabunPSK" w:cs="TH SarabunPSK"/>
                 <w:sz w:val="32"/>
                 <w:szCs w:val="32"/>
                 <w:lang w:bidi="th-TH"/>
@@ -5036,7 +5292,7 @@
             <w:pPr>
               <w:jc w:val="center"/>
               <w:rPr>
-                <w:rFonts w:ascii="TH SarabunPSK" w:hAnsi="TH SarabunPSK" w:cs="TH SarabunPSK" w:hint="cs"/>
+                <w:rFonts w:ascii="TH SarabunPSK" w:hAnsi="TH SarabunPSK" w:cs="TH SarabunPSK"/>
                 <w:sz w:val="32"/>
                 <w:szCs w:val="32"/>
                 <w:lang w:bidi="th-TH"/>
@@ -5065,7 +5321,7 @@
               <w:pStyle w:val="NormalWeb"/>
               <w:spacing w:before="0" w:beforeAutospacing="0" w:after="0" w:afterAutospacing="0"/>
               <w:rPr>
-                <w:rFonts w:ascii="TH SarabunPSK" w:hAnsi="TH SarabunPSK" w:cs="TH SarabunPSK" w:hint="cs"/>
+                <w:rFonts w:ascii="TH SarabunPSK" w:hAnsi="TH SarabunPSK" w:cs="TH SarabunPSK"/>
                 <w:color w:val="1F1F1F"/>
                 <w:sz w:val="32"/>
                 <w:szCs w:val="32"/>
@@ -5087,7 +5343,7 @@
           <w:p>
             <w:pPr>
               <w:rPr>
-                <w:rFonts w:ascii="TH SarabunPSK" w:hAnsi="TH SarabunPSK" w:cs="TH SarabunPSK" w:hint="cs"/>
+                <w:rFonts w:ascii="TH SarabunPSK" w:hAnsi="TH SarabunPSK" w:cs="TH SarabunPSK"/>
                 <w:sz w:val="32"/>
                 <w:szCs w:val="32"/>
                 <w:cs/>
@@ -5153,7 +5409,7 @@
           <w:p>
             <w:pPr>
               <w:rPr>
-                <w:rFonts w:ascii="TH SarabunPSK" w:hAnsi="TH SarabunPSK" w:cs="TH SarabunPSK" w:hint="cs"/>
+                <w:rFonts w:ascii="TH SarabunPSK" w:hAnsi="TH SarabunPSK" w:cs="TH SarabunPSK"/>
                 <w:sz w:val="32"/>
                 <w:szCs w:val="32"/>
                 <w:cs/>
@@ -5192,7 +5448,7 @@
           <w:p>
             <w:pPr>
               <w:rPr>
-                <w:rFonts w:ascii="TH SarabunPSK" w:hAnsi="TH SarabunPSK" w:cs="TH SarabunPSK" w:hint="cs"/>
+                <w:rFonts w:ascii="TH SarabunPSK" w:hAnsi="TH SarabunPSK" w:cs="TH SarabunPSK"/>
                 <w:sz w:val="32"/>
                 <w:szCs w:val="32"/>
                 <w:lang w:bidi="th-TH"/>
@@ -5302,7 +5558,7 @@
             <w:pPr>
               <w:jc w:val="center"/>
               <w:rPr>
-                <w:rFonts w:ascii="TH SarabunPSK" w:hAnsi="TH SarabunPSK" w:cs="TH SarabunPSK" w:hint="cs"/>
+                <w:rFonts w:ascii="TH SarabunPSK" w:hAnsi="TH SarabunPSK" w:cs="TH SarabunPSK"/>
                 <w:sz w:val="32"/>
                 <w:szCs w:val="32"/>
                 <w:lang w:bidi="th-TH"/>
@@ -5331,7 +5587,7 @@
               <w:pStyle w:val="NormalWeb"/>
               <w:spacing w:before="0" w:beforeAutospacing="0" w:after="0" w:afterAutospacing="0"/>
               <w:rPr>
-                <w:rFonts w:ascii="TH SarabunPSK" w:hAnsi="TH SarabunPSK" w:cs="TH SarabunPSK" w:hint="cs"/>
+                <w:rFonts w:ascii="TH SarabunPSK" w:hAnsi="TH SarabunPSK" w:cs="TH SarabunPSK"/>
                 <w:color w:val="1F1F1F"/>
                 <w:sz w:val="32"/>
                 <w:szCs w:val="32"/>
@@ -5353,7 +5609,7 @@
           <w:p>
             <w:pPr>
               <w:rPr>
-                <w:rFonts w:ascii="TH SarabunPSK" w:hAnsi="TH SarabunPSK" w:cs="TH SarabunPSK" w:hint="cs"/>
+                <w:rFonts w:ascii="TH SarabunPSK" w:hAnsi="TH SarabunPSK" w:cs="TH SarabunPSK"/>
                 <w:sz w:val="32"/>
                 <w:szCs w:val="32"/>
                 <w:cs/>
@@ -5419,7 +5675,7 @@
           <w:p>
             <w:pPr>
               <w:rPr>
-                <w:rFonts w:ascii="TH SarabunPSK" w:hAnsi="TH SarabunPSK" w:cs="TH SarabunPSK" w:hint="cs"/>
+                <w:rFonts w:ascii="TH SarabunPSK" w:hAnsi="TH SarabunPSK" w:cs="TH SarabunPSK"/>
                 <w:sz w:val="32"/>
                 <w:szCs w:val="32"/>
                 <w:cs/>
@@ -5489,7 +5745,7 @@
           <w:p>
             <w:pPr>
               <w:rPr>
-                <w:rFonts w:ascii="TH SarabunPSK" w:hAnsi="TH SarabunPSK" w:cs="TH SarabunPSK" w:hint="cs"/>
+                <w:rFonts w:ascii="TH SarabunPSK" w:hAnsi="TH SarabunPSK" w:cs="TH SarabunPSK"/>
                 <w:sz w:val="32"/>
                 <w:szCs w:val="32"/>
                 <w:lang w:bidi="th-TH"/>
@@ -5599,7 +5855,7 @@
             <w:pPr>
               <w:jc w:val="center"/>
               <w:rPr>
-                <w:rFonts w:ascii="TH SarabunPSK" w:hAnsi="TH SarabunPSK" w:cs="TH SarabunPSK" w:hint="cs"/>
+                <w:rFonts w:ascii="TH SarabunPSK" w:hAnsi="TH SarabunPSK" w:cs="TH SarabunPSK"/>
                 <w:sz w:val="32"/>
                 <w:szCs w:val="32"/>
                 <w:lang w:bidi="th-TH"/>
@@ -5628,7 +5884,7 @@
               <w:pStyle w:val="NormalWeb"/>
               <w:spacing w:before="0" w:beforeAutospacing="0" w:after="0" w:afterAutospacing="0"/>
               <w:rPr>
-                <w:rFonts w:ascii="TH SarabunPSK" w:hAnsi="TH SarabunPSK" w:cs="TH SarabunPSK" w:hint="cs"/>
+                <w:rFonts w:ascii="TH SarabunPSK" w:hAnsi="TH SarabunPSK" w:cs="TH SarabunPSK"/>
                 <w:color w:val="1F1F1F"/>
                 <w:sz w:val="32"/>
                 <w:szCs w:val="32"/>
@@ -5650,7 +5906,7 @@
           <w:p>
             <w:pPr>
               <w:rPr>
-                <w:rFonts w:ascii="TH SarabunPSK" w:hAnsi="TH SarabunPSK" w:cs="TH SarabunPSK" w:hint="cs"/>
+                <w:rFonts w:ascii="TH SarabunPSK" w:hAnsi="TH SarabunPSK" w:cs="TH SarabunPSK"/>
                 <w:sz w:val="32"/>
                 <w:szCs w:val="32"/>
                 <w:cs/>
@@ -5716,7 +5972,7 @@
           <w:p>
             <w:pPr>
               <w:rPr>
-                <w:rFonts w:ascii="TH SarabunPSK" w:hAnsi="TH SarabunPSK" w:cs="TH SarabunPSK" w:hint="cs"/>
+                <w:rFonts w:ascii="TH SarabunPSK" w:hAnsi="TH SarabunPSK" w:cs="TH SarabunPSK"/>
                 <w:sz w:val="32"/>
                 <w:szCs w:val="32"/>
                 <w:cs/>
@@ -5786,7 +6042,7 @@
           <w:p>
             <w:pPr>
               <w:rPr>
-                <w:rFonts w:ascii="TH SarabunPSK" w:hAnsi="TH SarabunPSK" w:cs="TH SarabunPSK" w:hint="cs"/>
+                <w:rFonts w:ascii="TH SarabunPSK" w:hAnsi="TH SarabunPSK" w:cs="TH SarabunPSK"/>
                 <w:sz w:val="32"/>
                 <w:szCs w:val="32"/>
                 <w:lang w:bidi="th-TH"/>
@@ -5897,7 +6153,7 @@
             <w:pPr>
               <w:jc w:val="center"/>
               <w:rPr>
-                <w:rFonts w:ascii="TH SarabunPSK" w:hAnsi="TH SarabunPSK" w:cs="TH SarabunPSK" w:hint="cs"/>
+                <w:rFonts w:ascii="TH SarabunPSK" w:hAnsi="TH SarabunPSK" w:cs="TH SarabunPSK"/>
                 <w:sz w:val="32"/>
                 <w:szCs w:val="32"/>
                 <w:lang w:bidi="th-TH"/>
@@ -5926,7 +6182,7 @@
               <w:pStyle w:val="NormalWeb"/>
               <w:spacing w:before="0" w:beforeAutospacing="0" w:after="0" w:afterAutospacing="0"/>
               <w:rPr>
-                <w:rFonts w:ascii="TH SarabunPSK" w:hAnsi="TH SarabunPSK" w:cs="TH SarabunPSK" w:hint="cs"/>
+                <w:rFonts w:ascii="TH SarabunPSK" w:hAnsi="TH SarabunPSK" w:cs="TH SarabunPSK"/>
                 <w:color w:val="1F1F1F"/>
                 <w:sz w:val="32"/>
                 <w:szCs w:val="32"/>
@@ -5948,7 +6204,7 @@
           <w:p>
             <w:pPr>
               <w:rPr>
-                <w:rFonts w:ascii="TH SarabunPSK" w:hAnsi="TH SarabunPSK" w:cs="TH SarabunPSK" w:hint="cs"/>
+                <w:rFonts w:ascii="TH SarabunPSK" w:hAnsi="TH SarabunPSK" w:cs="TH SarabunPSK"/>
                 <w:sz w:val="32"/>
                 <w:szCs w:val="32"/>
                 <w:lang w:bidi="th-TH"/>
@@ -6013,7 +6269,7 @@
           <w:p>
             <w:pPr>
               <w:rPr>
-                <w:rFonts w:ascii="TH SarabunPSK" w:hAnsi="TH SarabunPSK" w:cs="TH SarabunPSK" w:hint="cs"/>
+                <w:rFonts w:ascii="TH SarabunPSK" w:hAnsi="TH SarabunPSK" w:cs="TH SarabunPSK"/>
                 <w:sz w:val="32"/>
                 <w:szCs w:val="32"/>
                 <w:cs/>
@@ -6083,7 +6339,7 @@
           <w:p>
             <w:pPr>
               <w:rPr>
-                <w:rFonts w:ascii="TH SarabunPSK" w:hAnsi="TH SarabunPSK" w:cs="TH SarabunPSK" w:hint="cs"/>
+                <w:rFonts w:ascii="TH SarabunPSK" w:hAnsi="TH SarabunPSK" w:cs="TH SarabunPSK"/>
                 <w:sz w:val="32"/>
                 <w:szCs w:val="32"/>
                 <w:lang w:bidi="th-TH"/>
@@ -6194,7 +6450,7 @@
             <w:pPr>
               <w:jc w:val="center"/>
               <w:rPr>
-                <w:rFonts w:ascii="TH SarabunPSK" w:hAnsi="TH SarabunPSK" w:cs="TH SarabunPSK" w:hint="cs"/>
+                <w:rFonts w:ascii="TH SarabunPSK" w:hAnsi="TH SarabunPSK" w:cs="TH SarabunPSK"/>
                 <w:sz w:val="32"/>
                 <w:szCs w:val="32"/>
                 <w:lang w:bidi="th-TH"/>
@@ -6223,7 +6479,7 @@
               <w:pStyle w:val="NormalWeb"/>
               <w:spacing w:before="0" w:beforeAutospacing="0" w:after="0" w:afterAutospacing="0"/>
               <w:rPr>
-                <w:rFonts w:ascii="TH SarabunPSK" w:hAnsi="TH SarabunPSK" w:cs="TH SarabunPSK" w:hint="cs"/>
+                <w:rFonts w:ascii="TH SarabunPSK" w:hAnsi="TH SarabunPSK" w:cs="TH SarabunPSK"/>
                 <w:color w:val="1F1F1F"/>
                 <w:sz w:val="32"/>
                 <w:szCs w:val="32"/>
@@ -6245,7 +6501,7 @@
           <w:p>
             <w:pPr>
               <w:rPr>
-                <w:rFonts w:ascii="TH SarabunPSK" w:hAnsi="TH SarabunPSK" w:cs="TH SarabunPSK" w:hint="cs"/>
+                <w:rFonts w:ascii="TH SarabunPSK" w:hAnsi="TH SarabunPSK" w:cs="TH SarabunPSK"/>
                 <w:sz w:val="32"/>
                 <w:szCs w:val="32"/>
                 <w:lang w:bidi="th-TH"/>
@@ -6310,7 +6566,7 @@
           <w:p>
             <w:pPr>
               <w:rPr>
-                <w:rFonts w:ascii="TH SarabunPSK" w:hAnsi="TH SarabunPSK" w:cs="TH SarabunPSK" w:hint="cs"/>
+                <w:rFonts w:ascii="TH SarabunPSK" w:hAnsi="TH SarabunPSK" w:cs="TH SarabunPSK"/>
                 <w:sz w:val="32"/>
                 <w:szCs w:val="32"/>
                 <w:cs/>
@@ -6380,7 +6636,7 @@
           <w:p>
             <w:pPr>
               <w:rPr>
-                <w:rFonts w:ascii="TH SarabunPSK" w:hAnsi="TH SarabunPSK" w:cs="TH SarabunPSK" w:hint="cs"/>
+                <w:rFonts w:ascii="TH SarabunPSK" w:hAnsi="TH SarabunPSK" w:cs="TH SarabunPSK"/>
                 <w:sz w:val="32"/>
                 <w:szCs w:val="32"/>
                 <w:lang w:bidi="th-TH"/>

</xml_diff>